<commit_message>
Las casillas de las fichas se marcan dentro del recuadro
En la ficha de preinscripcion la marca de Pueblo de Pertenencia y la de las
preguntas de alergia y salud caian fuera de su cuadrito; ahora el cuadrito
mismo aparece marcado.

En la carta de compromiso la marca de cada documento de papeleria va dentro
de su recuadro, y el No. DPI deja de quedar pegado al nombre.

En la ficha de asignacion, junto al cuadrito de SI ya se lee la palabra SI,
como ya pasaba con el de No.

La guia de despliegue estrena un camino gratis de punta a punta con
direcciones que no caducan.
</commit_message>
<xml_diff>
--- a/backend/UmesIsel.Api/Resources/CartaCompromisoTemplate.docx
+++ b/backend/UmesIsel.Api/Resources/CartaCompromisoTemplate.docx
@@ -304,7 +304,27 @@
                           <a:schemeClr val="dk1"/>
                         </a:fontRef>
                       </wps:style>
-                      <wps:bodyPr rot="0" spcFirstLastPara="0" vertOverflow="overflow" horzOverflow="overflow" vert="horz" wrap="square" lIns="91440" tIns="45720" rIns="91440" bIns="45720" numCol="1" spcCol="0" rtlCol="0" fromWordArt="0" anchor="ctr" anchorCtr="0" forceAA="0" compatLnSpc="1">
+                      <wps:txbx>
+                        <w:txbxContent>
+                          <w:p>
+                            <w:pPr>
+                              <w:spacing w:before="0" w:after="0" w:line="240" w:lineRule="auto"/>
+                              <w:jc w:val="center"/>
+                            </w:pPr>
+                            <w:r>
+                              <w:rPr>
+                                <w:rFonts w:ascii="Arial" w:hAnsi="Arial"/>
+                                <w:b/>
+                                <w:color w:val="000000"/>
+                                <w:sz w:val="18"/>
+                                <w:szCs w:val="18"/>
+                              </w:rPr>
+                              <w:t>{{DOC_DPI}}</w:t>
+                            </w:r>
+                          </w:p>
+                        </w:txbxContent>
+                      </wps:txbx>
+                      <wps:bodyPr rot="0" spcFirstLastPara="0" vertOverflow="overflow" horzOverflow="overflow" vert="horz" wrap="square" lIns="0" tIns="0" rIns="0" bIns="0" numCol="1" spcCol="0" rtlCol="0" fromWordArt="0" anchor="ctr" anchorCtr="0" forceAA="0" compatLnSpc="1">
                         <a:prstTxWarp prst="textNoShape">
                           <a:avLst/>
                         </a:prstTxWarp>
@@ -337,9 +357,6 @@
           <w:lang w:val="es-GT" w:eastAsia="en-US"/>
         </w:rPr>
         <w:t>Fotocopia de DPI autenticada</w:t>
-      </w:r>
-      <w:r>
-        <w:t xml:space="preserve"> {{DOC_DPI}}</w:t>
       </w:r>
     </w:p>
     <w:p>
@@ -409,7 +426,27 @@
                           <a:schemeClr val="dk1"/>
                         </a:fontRef>
                       </wps:style>
-                      <wps:bodyPr rot="0" spcFirstLastPara="0" vertOverflow="overflow" horzOverflow="overflow" vert="horz" wrap="square" lIns="91440" tIns="45720" rIns="91440" bIns="45720" numCol="1" spcCol="0" rtlCol="0" fromWordArt="0" anchor="ctr" anchorCtr="0" forceAA="0" compatLnSpc="1">
+                      <wps:txbx>
+                        <w:txbxContent>
+                          <w:p>
+                            <w:pPr>
+                              <w:spacing w:before="0" w:after="0" w:line="240" w:lineRule="auto"/>
+                              <w:jc w:val="center"/>
+                            </w:pPr>
+                            <w:r>
+                              <w:rPr>
+                                <w:rFonts w:ascii="Arial" w:hAnsi="Arial"/>
+                                <w:b/>
+                                <w:color w:val="000000"/>
+                                <w:sz w:val="18"/>
+                                <w:szCs w:val="18"/>
+                              </w:rPr>
+                              <w:t>{{DOC_FOTOS}}</w:t>
+                            </w:r>
+                          </w:p>
+                        </w:txbxContent>
+                      </wps:txbx>
+                      <wps:bodyPr rot="0" spcFirstLastPara="0" vertOverflow="overflow" horzOverflow="overflow" vert="horz" wrap="square" lIns="0" tIns="0" rIns="0" bIns="0" numCol="1" spcCol="0" rtlCol="0" fromWordArt="0" anchor="ctr" anchorCtr="0" forceAA="0" compatLnSpc="1">
                         <a:prstTxWarp prst="textNoShape">
                           <a:avLst/>
                         </a:prstTxWarp>
@@ -442,9 +479,6 @@
           <w:lang w:val="es-GT" w:eastAsia="en-US"/>
         </w:rPr>
         <w:t>2 fotografías en blanco y negro de 3x4 cm impresas en papel mate</w:t>
-      </w:r>
-      <w:r>
-        <w:t xml:space="preserve"> {{DOC_FOTOS}}</w:t>
       </w:r>
     </w:p>
     <w:p>
@@ -514,7 +548,27 @@
                           <a:schemeClr val="dk1"/>
                         </a:fontRef>
                       </wps:style>
-                      <wps:bodyPr rot="0" spcFirstLastPara="0" vertOverflow="overflow" horzOverflow="overflow" vert="horz" wrap="square" lIns="91440" tIns="45720" rIns="91440" bIns="45720" numCol="1" spcCol="0" rtlCol="0" fromWordArt="0" anchor="ctr" anchorCtr="0" forceAA="0" compatLnSpc="1">
+                      <wps:txbx>
+                        <w:txbxContent>
+                          <w:p>
+                            <w:pPr>
+                              <w:spacing w:before="0" w:after="0" w:line="240" w:lineRule="auto"/>
+                              <w:jc w:val="center"/>
+                            </w:pPr>
+                            <w:r>
+                              <w:rPr>
+                                <w:rFonts w:ascii="Arial" w:hAnsi="Arial"/>
+                                <w:b/>
+                                <w:color w:val="000000"/>
+                                <w:sz w:val="18"/>
+                                <w:szCs w:val="18"/>
+                              </w:rPr>
+                              <w:t>{{DOC_TITULO_MEDIO}}</w:t>
+                            </w:r>
+                          </w:p>
+                        </w:txbxContent>
+                      </wps:txbx>
+                      <wps:bodyPr rot="0" spcFirstLastPara="0" vertOverflow="overflow" horzOverflow="overflow" vert="horz" wrap="square" lIns="0" tIns="0" rIns="0" bIns="0" numCol="1" spcCol="0" rtlCol="0" fromWordArt="0" anchor="ctr" anchorCtr="0" forceAA="0" compatLnSpc="1">
                         <a:prstTxWarp prst="textNoShape">
                           <a:avLst/>
                         </a:prstTxWarp>
@@ -582,9 +636,6 @@
           <w:lang w:val="es-GT" w:eastAsia="en-US"/>
         </w:rPr>
         <w:t>edio</w:t>
-      </w:r>
-      <w:r>
-        <w:t xml:space="preserve"> {{DOC_TITULO_MEDIO}}</w:t>
       </w:r>
     </w:p>
     <w:p>
@@ -653,7 +704,27 @@
                           <a:schemeClr val="dk1"/>
                         </a:fontRef>
                       </wps:style>
-                      <wps:bodyPr rot="0" spcFirstLastPara="0" vertOverflow="overflow" horzOverflow="overflow" vert="horz" wrap="square" lIns="91440" tIns="45720" rIns="91440" bIns="45720" numCol="1" spcCol="0" rtlCol="0" fromWordArt="0" anchor="ctr" anchorCtr="0" forceAA="0" compatLnSpc="1">
+                      <wps:txbx>
+                        <w:txbxContent>
+                          <w:p>
+                            <w:pPr>
+                              <w:spacing w:before="0" w:after="0" w:line="240" w:lineRule="auto"/>
+                              <w:jc w:val="center"/>
+                            </w:pPr>
+                            <w:r>
+                              <w:rPr>
+                                <w:rFonts w:ascii="Arial" w:hAnsi="Arial"/>
+                                <w:b/>
+                                <w:color w:val="000000"/>
+                                <w:sz w:val="18"/>
+                                <w:szCs w:val="18"/>
+                              </w:rPr>
+                              <w:t>{{DOC_TITULO_LICENCIATURA}}</w:t>
+                            </w:r>
+                          </w:p>
+                        </w:txbxContent>
+                      </wps:txbx>
+                      <wps:bodyPr rot="0" spcFirstLastPara="0" vertOverflow="overflow" horzOverflow="overflow" vert="horz" wrap="square" lIns="0" tIns="0" rIns="0" bIns="0" numCol="1" spcCol="0" rtlCol="0" fromWordArt="0" anchor="ctr" anchorCtr="0" forceAA="0" compatLnSpc="1">
                         <a:prstTxWarp prst="textNoShape">
                           <a:avLst/>
                         </a:prstTxWarp>
@@ -703,9 +774,6 @@
           <w:lang w:val="es-GT" w:eastAsia="en-US"/>
         </w:rPr>
         <w:t>de Licenciatura</w:t>
-      </w:r>
-      <w:r>
-        <w:t xml:space="preserve"> {{DOC_TITULO_LICENCIATURA}}</w:t>
       </w:r>
     </w:p>
     <w:p>
@@ -822,7 +890,27 @@
                           <a:schemeClr val="dk1"/>
                         </a:fontRef>
                       </wps:style>
-                      <wps:bodyPr rot="0" spcFirstLastPara="0" vertOverflow="overflow" horzOverflow="overflow" vert="horz" wrap="square" lIns="91440" tIns="45720" rIns="91440" bIns="45720" numCol="1" spcCol="0" rtlCol="0" fromWordArt="0" anchor="ctr" anchorCtr="0" forceAA="0" compatLnSpc="1">
+                      <wps:txbx>
+                        <w:txbxContent>
+                          <w:p>
+                            <w:pPr>
+                              <w:spacing w:before="0" w:after="0" w:line="240" w:lineRule="auto"/>
+                              <w:jc w:val="center"/>
+                            </w:pPr>
+                            <w:r>
+                              <w:rPr>
+                                <w:rFonts w:ascii="Arial" w:hAnsi="Arial"/>
+                                <w:b/>
+                                <w:color w:val="000000"/>
+                                <w:sz w:val="18"/>
+                                <w:szCs w:val="18"/>
+                              </w:rPr>
+                              <w:t>{{DOC_FOTOS_EXTRANJERO}}</w:t>
+                            </w:r>
+                          </w:p>
+                        </w:txbxContent>
+                      </wps:txbx>
+                      <wps:bodyPr rot="0" spcFirstLastPara="0" vertOverflow="overflow" horzOverflow="overflow" vert="horz" wrap="square" lIns="0" tIns="0" rIns="0" bIns="0" numCol="1" spcCol="0" rtlCol="0" fromWordArt="0" anchor="ctr" anchorCtr="0" forceAA="0" compatLnSpc="1">
                         <a:prstTxWarp prst="textNoShape">
                           <a:avLst/>
                         </a:prstTxWarp>
@@ -907,7 +995,27 @@
                           <a:schemeClr val="dk1"/>
                         </a:fontRef>
                       </wps:style>
-                      <wps:bodyPr rot="0" spcFirstLastPara="0" vertOverflow="overflow" horzOverflow="overflow" vert="horz" wrap="square" lIns="91440" tIns="45720" rIns="91440" bIns="45720" numCol="1" spcCol="0" rtlCol="0" fromWordArt="0" anchor="ctr" anchorCtr="0" forceAA="0" compatLnSpc="1">
+                      <wps:txbx>
+                        <w:txbxContent>
+                          <w:p>
+                            <w:pPr>
+                              <w:spacing w:before="0" w:after="0" w:line="240" w:lineRule="auto"/>
+                              <w:jc w:val="center"/>
+                            </w:pPr>
+                            <w:r>
+                              <w:rPr>
+                                <w:rFonts w:ascii="Arial" w:hAnsi="Arial"/>
+                                <w:b/>
+                                <w:color w:val="000000"/>
+                                <w:sz w:val="18"/>
+                                <w:szCs w:val="18"/>
+                              </w:rPr>
+                              <w:t>{{DOC_PASAPORTE}}</w:t>
+                            </w:r>
+                          </w:p>
+                        </w:txbxContent>
+                      </wps:txbx>
+                      <wps:bodyPr rot="0" spcFirstLastPara="0" vertOverflow="overflow" horzOverflow="overflow" vert="horz" wrap="square" lIns="0" tIns="0" rIns="0" bIns="0" numCol="1" spcCol="0" rtlCol="0" fromWordArt="0" anchor="ctr" anchorCtr="0" forceAA="0" compatLnSpc="1">
                         <a:prstTxWarp prst="textNoShape">
                           <a:avLst/>
                         </a:prstTxWarp>
@@ -947,9 +1055,6 @@
           <w:lang w:val="es-GT" w:eastAsia="en-US"/>
         </w:rPr>
         <w:t>Pasaporte completo autenticado</w:t>
-      </w:r>
-      <w:r>
-        <w:t xml:space="preserve"> {{DOC_PASAPORTE}}</w:t>
       </w:r>
     </w:p>
     <w:p>
@@ -1019,7 +1124,27 @@
                           <a:schemeClr val="dk1"/>
                         </a:fontRef>
                       </wps:style>
-                      <wps:bodyPr rot="0" spcFirstLastPara="0" vertOverflow="overflow" horzOverflow="overflow" vert="horz" wrap="square" lIns="91440" tIns="45720" rIns="91440" bIns="45720" numCol="1" spcCol="0" rtlCol="0" fromWordArt="0" anchor="ctr" anchorCtr="0" forceAA="0" compatLnSpc="1">
+                      <wps:txbx>
+                        <w:txbxContent>
+                          <w:p>
+                            <w:pPr>
+                              <w:spacing w:before="0" w:after="0" w:line="240" w:lineRule="auto"/>
+                              <w:jc w:val="center"/>
+                            </w:pPr>
+                            <w:r>
+                              <w:rPr>
+                                <w:rFonts w:ascii="Arial" w:hAnsi="Arial"/>
+                                <w:b/>
+                                <w:color w:val="000000"/>
+                                <w:sz w:val="18"/>
+                                <w:szCs w:val="18"/>
+                              </w:rPr>
+                              <w:t>{{DOC_TITULO_MEDIO_EXTRANJERO}}</w:t>
+                            </w:r>
+                          </w:p>
+                        </w:txbxContent>
+                      </wps:txbx>
+                      <wps:bodyPr rot="0" spcFirstLastPara="0" vertOverflow="overflow" horzOverflow="overflow" vert="horz" wrap="square" lIns="0" tIns="0" rIns="0" bIns="0" numCol="1" spcCol="0" rtlCol="0" fromWordArt="0" anchor="ctr" anchorCtr="0" forceAA="0" compatLnSpc="1">
                         <a:prstTxWarp prst="textNoShape">
                           <a:avLst/>
                         </a:prstTxWarp>
@@ -1052,9 +1177,6 @@
           <w:lang w:val="es-GT" w:eastAsia="en-US"/>
         </w:rPr>
         <w:t>2 fotografías en blanco y negro de 3x4 cm impresas en papel mate</w:t>
-      </w:r>
-      <w:r>
-        <w:t xml:space="preserve"> {{DOC_FOTOS_EXTRANJERO}}</w:t>
       </w:r>
     </w:p>
     <w:p>
@@ -1217,9 +1339,6 @@
         </w:rPr>
         <w:t>ducación.</w:t>
       </w:r>
-      <w:r>
-        <w:t xml:space="preserve"> {{DOC_TITULO_MEDIO_EXTRANJERO}}</w:t>
-      </w:r>
     </w:p>
     <w:p>
       <w:pPr>
@@ -1288,7 +1407,27 @@
                           <a:schemeClr val="dk1"/>
                         </a:fontRef>
                       </wps:style>
-                      <wps:bodyPr rot="0" spcFirstLastPara="0" vertOverflow="overflow" horzOverflow="overflow" vert="horz" wrap="square" lIns="91440" tIns="45720" rIns="91440" bIns="45720" numCol="1" spcCol="0" rtlCol="0" fromWordArt="0" anchor="ctr" anchorCtr="0" forceAA="0" compatLnSpc="1">
+                      <wps:txbx>
+                        <w:txbxContent>
+                          <w:p>
+                            <w:pPr>
+                              <w:spacing w:before="0" w:after="0" w:line="240" w:lineRule="auto"/>
+                              <w:jc w:val="center"/>
+                            </w:pPr>
+                            <w:r>
+                              <w:rPr>
+                                <w:rFonts w:ascii="Arial" w:hAnsi="Arial"/>
+                                <w:b/>
+                                <w:color w:val="000000"/>
+                                <w:sz w:val="18"/>
+                                <w:szCs w:val="18"/>
+                              </w:rPr>
+                              <w:t>{{DOC_TITULO_PREGRADO}}</w:t>
+                            </w:r>
+                          </w:p>
+                        </w:txbxContent>
+                      </wps:txbx>
+                      <wps:bodyPr rot="0" spcFirstLastPara="0" vertOverflow="overflow" horzOverflow="overflow" vert="horz" wrap="square" lIns="0" tIns="0" rIns="0" bIns="0" numCol="1" spcCol="0" rtlCol="0" fromWordArt="0" anchor="ctr" anchorCtr="0" forceAA="0" compatLnSpc="1">
                         <a:prstTxWarp prst="textNoShape">
                           <a:avLst/>
                         </a:prstTxWarp>
@@ -1343,9 +1482,6 @@
         </w:rPr>
         <w:t xml:space="preserve">o y apostillado </w:t>
       </w:r>
-      <w:r>
-        <w:t xml:space="preserve"> {{DOC_TITULO_PREGRADO}}</w:t>
-      </w:r>
     </w:p>
     <w:p>
       <w:pPr>
@@ -1508,6 +1644,9 @@
     </w:p>
     <w:p>
       <w:pPr>
+        <w:tabs>
+          <w:tab w:val="left" w:pos="5400"/>
+        </w:tabs>
         <w:jc w:val="both"/>
         <w:rPr>
           <w:rFonts w:ascii="Maiandra GD" w:hAnsi="Maiandra GD"/>

</xml_diff>